<commit_message>
Add comments and small fixes.
</commit_message>
<xml_diff>
--- a/frontend/Frontend.docx
+++ b/frontend/Frontend.docx
@@ -8,12 +8,14 @@
           <w:rFonts w:ascii="Times New Roman" w:hAnsi="Times New Roman" w:cs="Times New Roman"/>
         </w:rPr>
       </w:pPr>
-      <w:r>
-        <w:rPr>
-          <w:rFonts w:ascii="Times New Roman" w:hAnsi="Times New Roman" w:cs="Times New Roman"/>
-        </w:rPr>
-        <w:t>Angular Fron</w:t>
-      </w:r>
+      <w:proofErr w:type="spellStart"/>
+      <w:r>
+        <w:rPr>
+          <w:rFonts w:ascii="Times New Roman" w:hAnsi="Times New Roman" w:cs="Times New Roman"/>
+        </w:rPr>
+        <w:t>OrganUI</w:t>
+      </w:r>
+      <w:proofErr w:type="spellEnd"/>
       <w:r>
         <w:rPr>
           <w:rFonts w:ascii="Times New Roman" w:hAnsi="Times New Roman" w:cs="Times New Roman"/>
@@ -25,27 +27,25 @@
       <w:pPr>
         <w:rPr>
           <w:rFonts w:ascii="Times New Roman" w:hAnsi="Times New Roman" w:cs="Times New Roman"/>
+        </w:rPr>
+      </w:pPr>
+      <w:r>
+        <w:rPr>
+          <w:rFonts w:ascii="Times New Roman" w:hAnsi="Times New Roman" w:cs="Times New Roman"/>
+        </w:rPr>
+        <w:t>It is one of the components of the "Dancing Pipes." In our project, it facilitates a clearer visualization for users, showing the consequences of their commands issued via gestures in the camera component. This integration ensures that users can intuitively interact with the system, seeing the real-time impact of their actions on the interface.</w:t>
+      </w:r>
+    </w:p>
+    <w:p>
+      <w:pPr>
+        <w:rPr>
+          <w:rFonts w:ascii="Times New Roman" w:hAnsi="Times New Roman" w:cs="Times New Roman"/>
           <w:lang w:val="ru-RU"/>
         </w:rPr>
       </w:pPr>
       <w:r>
         <w:rPr>
           <w:rFonts w:ascii="Times New Roman" w:hAnsi="Times New Roman" w:cs="Times New Roman"/>
-        </w:rPr>
-        <w:t>It is one of the components of the "Dancing Pipes." In our project, it facilitates a clearer visualization for users, showing the consequences of their commands issued via gestures in the camera component. This integration ensures that users can intuitively interact with the system, seeing the real-time impact of their actions on the interface.</w:t>
-      </w:r>
-    </w:p>
-    <w:p>
-      <w:pPr>
-        <w:rPr>
-          <w:rFonts w:ascii="Times New Roman" w:hAnsi="Times New Roman" w:cs="Times New Roman"/>
-          <w:lang w:val="ru-RU"/>
-        </w:rPr>
-      </w:pPr>
-      <w:r>
-        <w:rPr>
-          <w:rFonts w:ascii="Times New Roman" w:hAnsi="Times New Roman" w:cs="Times New Roman"/>
-          <w:lang w:val="ru-RU"/>
         </w:rPr>
         <w:br/>
       </w:r>
@@ -84,13 +84,7 @@
         <w:rPr>
           <w:rFonts w:ascii="Times New Roman" w:hAnsi="Times New Roman" w:cs="Times New Roman"/>
         </w:rPr>
-        <w:t>It</w:t>
-      </w:r>
-      <w:r>
-        <w:rPr>
-          <w:rFonts w:ascii="Times New Roman" w:hAnsi="Times New Roman" w:cs="Times New Roman"/>
-        </w:rPr>
-        <w:t xml:space="preserve"> is popular for its powerful features like </w:t>
+        <w:t xml:space="preserve">It is popular for its powerful features like </w:t>
       </w:r>
       <w:proofErr w:type="gramStart"/>
       <w:r>
@@ -128,31 +122,7 @@
         <w:rPr>
           <w:rFonts w:ascii="Times New Roman" w:hAnsi="Times New Roman" w:cs="Times New Roman"/>
         </w:rPr>
-        <w:t>Reason</w:t>
-      </w:r>
-      <w:r>
-        <w:rPr>
-          <w:rFonts w:ascii="Times New Roman" w:hAnsi="Times New Roman" w:cs="Times New Roman"/>
-        </w:rPr>
-        <w:t>: We</w:t>
-      </w:r>
-      <w:r>
-        <w:rPr>
-          <w:rFonts w:ascii="Times New Roman" w:hAnsi="Times New Roman" w:cs="Times New Roman"/>
-        </w:rPr>
-        <w:t xml:space="preserve"> use Angular as the main framework to build the frontend application. It's chosen for its strong ability to create dynamic single-page applications (SPAs).</w:t>
-      </w:r>
-      <w:r>
-        <w:rPr>
-          <w:rFonts w:ascii="Times New Roman" w:hAnsi="Times New Roman" w:cs="Times New Roman"/>
-        </w:rPr>
-        <w:t xml:space="preserve"> </w:t>
-      </w:r>
-      <w:r>
-        <w:rPr>
-          <w:rFonts w:ascii="Times New Roman" w:hAnsi="Times New Roman" w:cs="Times New Roman"/>
-        </w:rPr>
-        <w:t>This framework is great for learning advanced web development skills too.</w:t>
+        <w:t>Reason: We use Angular as the main framework to build the frontend application. It's chosen for its strong ability to create dynamic single-page applications (SPAs). This framework is great for learning advanced web development skills too.</w:t>
       </w:r>
     </w:p>
     <w:p>
@@ -170,7 +140,25 @@
         <w:rPr>
           <w:rFonts w:ascii="Times New Roman" w:hAnsi="Times New Roman" w:cs="Times New Roman"/>
         </w:rPr>
-        <w:t>TypeScript: We use TypeScript for writing the application because it comes with Angular. TypeScript adds rules about data types to JavaScript, making the code cleaner and reducing common errors.</w:t>
+        <w:t xml:space="preserve">TypeScript: </w:t>
+      </w:r>
+      <w:r>
+        <w:rPr>
+          <w:rFonts w:ascii="Times New Roman" w:hAnsi="Times New Roman" w:cs="Times New Roman"/>
+        </w:rPr>
+        <w:t>It helps manage large projects by catching errors early in development, which saves time and improves the quality of the code.</w:t>
+      </w:r>
+      <w:r>
+        <w:rPr>
+          <w:rFonts w:ascii="Times New Roman" w:hAnsi="Times New Roman" w:cs="Times New Roman"/>
+        </w:rPr>
+        <w:t xml:space="preserve"> </w:t>
+      </w:r>
+      <w:r>
+        <w:rPr>
+          <w:rFonts w:ascii="Times New Roman" w:hAnsi="Times New Roman" w:cs="Times New Roman"/>
+        </w:rPr>
+        <w:t>TypeScript adds rules about data types to JavaScript, making the code cleaner and reducing common errors.</w:t>
       </w:r>
     </w:p>
     <w:p>
@@ -188,7 +176,13 @@
         <w:rPr>
           <w:rFonts w:ascii="Times New Roman" w:hAnsi="Times New Roman" w:cs="Times New Roman"/>
         </w:rPr>
-        <w:t>Reason: It helps manage large projects by catching errors early in development, which saves time and improves the quality of the code.</w:t>
+        <w:t>Reason</w:t>
+      </w:r>
+      <w:r>
+        <w:rPr>
+          <w:rFonts w:ascii="Times New Roman" w:hAnsi="Times New Roman" w:cs="Times New Roman"/>
+        </w:rPr>
+        <w:t xml:space="preserve">: We use TypeScript for writing the application because it comes with Angular. </w:t>
       </w:r>
     </w:p>
     <w:p>
@@ -206,7 +200,13 @@
         <w:rPr>
           <w:rFonts w:ascii="Times New Roman" w:hAnsi="Times New Roman" w:cs="Times New Roman"/>
         </w:rPr>
-        <w:t>Material Design: We incorporate Google’s Material Design via Angular Material to make sure the app looks good and works well across different platforms.</w:t>
+        <w:t xml:space="preserve">Angular </w:t>
+      </w:r>
+      <w:r>
+        <w:rPr>
+          <w:rFonts w:ascii="Times New Roman" w:hAnsi="Times New Roman" w:cs="Times New Roman"/>
+        </w:rPr>
+        <w:t>Material: We incorporate Angular Material to make sure the app looks good and works well across different platforms.</w:t>
       </w:r>
     </w:p>
     <w:p>
@@ -345,11 +345,6 @@
           <w:rFonts w:ascii="Times New Roman" w:hAnsi="Times New Roman" w:cs="Times New Roman"/>
         </w:rPr>
         <w:br/>
-      </w:r>
-      <w:r>
-        <w:rPr>
-          <w:rFonts w:ascii="Times New Roman" w:hAnsi="Times New Roman" w:cs="Times New Roman"/>
-        </w:rPr>
         <w:t xml:space="preserve">In the frontend architecture of our project, we have structured the application using a variety of Angular components and services to ensure a cohesive and efficient user experience. </w:t>
       </w:r>
       <w:r>
@@ -357,13 +352,7 @@
           <w:rFonts w:ascii="Times New Roman" w:hAnsi="Times New Roman" w:cs="Times New Roman"/>
         </w:rPr>
         <w:br/>
-        <w:t>C</w:t>
-      </w:r>
-      <w:r>
-        <w:rPr>
-          <w:rFonts w:ascii="Times New Roman" w:hAnsi="Times New Roman" w:cs="Times New Roman"/>
-        </w:rPr>
-        <w:t>omponents</w:t>
+        <w:t>Components</w:t>
       </w:r>
       <w:r>
         <w:rPr>
@@ -952,6 +941,7 @@
       <w:r>
         <w:rPr>
           <w:rFonts w:ascii="Times New Roman" w:hAnsi="Times New Roman" w:cs="Times New Roman"/>
+          <w:noProof/>
         </w:rPr>
         <w:drawing>
           <wp:inline distT="0" distB="0" distL="0" distR="0" wp14:anchorId="746D60B2" wp14:editId="4259CDC1">
@@ -1208,7 +1198,13 @@
         <w:rPr>
           <w:rFonts w:ascii="Times New Roman" w:hAnsi="Times New Roman" w:cs="Times New Roman"/>
         </w:rPr>
-        <w:t>): Initializes the form with predefined validators, setting default values for the login and password fields.</w:t>
+        <w:t>): Initializes the form with predefined validators</w:t>
+      </w:r>
+      <w:r>
+        <w:rPr>
+          <w:rFonts w:ascii="Times New Roman" w:hAnsi="Times New Roman" w:cs="Times New Roman"/>
+        </w:rPr>
+        <w:t>.</w:t>
       </w:r>
     </w:p>
     <w:p>
@@ -1407,6 +1403,7 @@
       <w:r>
         <w:rPr>
           <w:rFonts w:ascii="Times New Roman" w:hAnsi="Times New Roman" w:cs="Times New Roman"/>
+          <w:noProof/>
         </w:rPr>
         <w:lastRenderedPageBreak/>
         <w:drawing>
@@ -1631,6 +1628,7 @@
       <w:r>
         <w:rPr>
           <w:rFonts w:ascii="Times New Roman" w:eastAsia="Times New Roman" w:hAnsi="Times New Roman" w:cs="Times New Roman"/>
+          <w:noProof/>
           <w:kern w:val="0"/>
           <w:sz w:val="24"/>
           <w:szCs w:val="24"/>
@@ -1868,7 +1866,19 @@
         <w:rPr>
           <w:rFonts w:ascii="Times New Roman" w:hAnsi="Times New Roman" w:cs="Times New Roman"/>
         </w:rPr>
-        <w:t xml:space="preserve"> is an Angular component designed to display real-time command data related to the operation of the musical instrument system. It interfaces directly with server-sent events (SSE) to receive updates and present them to the user in an engaging and informative way.</w:t>
+        <w:t xml:space="preserve"> is an Angular component designed to display real-time command data related to the operation of the </w:t>
+      </w:r>
+      <w:r>
+        <w:rPr>
+          <w:rFonts w:ascii="Times New Roman" w:hAnsi="Times New Roman" w:cs="Times New Roman"/>
+        </w:rPr>
+        <w:t>Organ Sequencer</w:t>
+      </w:r>
+      <w:r>
+        <w:rPr>
+          <w:rFonts w:ascii="Times New Roman" w:hAnsi="Times New Roman" w:cs="Times New Roman"/>
+        </w:rPr>
+        <w:t>. It interfaces directly with server-sent events (SSE) to receive updates and present them to the user in an engaging and informative way.</w:t>
       </w:r>
     </w:p>
     <w:p>
@@ -2093,6 +2103,7 @@
       <w:r>
         <w:rPr>
           <w:rFonts w:ascii="Times New Roman" w:hAnsi="Times New Roman" w:cs="Times New Roman"/>
+          <w:noProof/>
         </w:rPr>
         <w:drawing>
           <wp:inline distT="0" distB="0" distL="0" distR="0" wp14:anchorId="0C21D212" wp14:editId="163CC544">
@@ -2291,6 +2302,7 @@
       <w:r>
         <w:rPr>
           <w:rFonts w:ascii="Times New Roman" w:hAnsi="Times New Roman" w:cs="Times New Roman"/>
+          <w:noProof/>
         </w:rPr>
         <w:drawing>
           <wp:inline distT="0" distB="0" distL="0" distR="0" wp14:anchorId="23FF4E30" wp14:editId="4543BF2F">
@@ -2607,6 +2619,7 @@
       <w:r>
         <w:rPr>
           <w:rFonts w:ascii="Times New Roman" w:hAnsi="Times New Roman" w:cs="Times New Roman"/>
+          <w:noProof/>
         </w:rPr>
         <w:lastRenderedPageBreak/>
         <w:drawing>
@@ -2705,6 +2718,7 @@
       <w:r>
         <w:rPr>
           <w:rFonts w:ascii="Times New Roman" w:hAnsi="Times New Roman" w:cs="Times New Roman"/>
+          <w:noProof/>
         </w:rPr>
         <w:drawing>
           <wp:inline distT="0" distB="0" distL="0" distR="0" wp14:anchorId="7AC3A04B" wp14:editId="1291BEE6">
@@ -2828,6 +2842,7 @@
       <w:r>
         <w:rPr>
           <w:rFonts w:ascii="Times New Roman" w:hAnsi="Times New Roman" w:cs="Times New Roman"/>
+          <w:noProof/>
         </w:rPr>
         <w:lastRenderedPageBreak/>
         <w:drawing>
@@ -3225,6 +3240,7 @@
       <w:r>
         <w:rPr>
           <w:rFonts w:ascii="Times New Roman" w:hAnsi="Times New Roman" w:cs="Times New Roman"/>
+          <w:noProof/>
         </w:rPr>
         <w:drawing>
           <wp:inline distT="0" distB="0" distL="0" distR="0" wp14:anchorId="4B514004" wp14:editId="20172BA0">
@@ -3705,11 +3721,6 @@
           <w:rFonts w:ascii="Times New Roman" w:hAnsi="Times New Roman" w:cs="Times New Roman"/>
         </w:rPr>
         <w:br/>
-      </w:r>
-      <w:r>
-        <w:rPr>
-          <w:rFonts w:ascii="Times New Roman" w:hAnsi="Times New Roman" w:cs="Times New Roman"/>
-        </w:rPr>
         <w:t xml:space="preserve">The </w:t>
       </w:r>
       <w:proofErr w:type="spellStart"/>
@@ -3724,24 +3735,19 @@
         <w:rPr>
           <w:rFonts w:ascii="Times New Roman" w:hAnsi="Times New Roman" w:cs="Times New Roman"/>
         </w:rPr>
-        <w:t xml:space="preserve">. </w:t>
-      </w:r>
-      <w:r>
-        <w:rPr>
-          <w:rFonts w:ascii="Times New Roman" w:hAnsi="Times New Roman" w:cs="Times New Roman"/>
-        </w:rPr>
-        <w:t>This guard ensures that only authenticated users can access dashboard.</w:t>
-      </w:r>
-    </w:p>
-    <w:p>
-      <w:pPr>
-        <w:rPr>
-          <w:rFonts w:ascii="Times New Roman" w:hAnsi="Times New Roman" w:cs="Times New Roman"/>
-        </w:rPr>
-      </w:pPr>
-      <w:r>
-        <w:rPr>
-          <w:rFonts w:ascii="Times New Roman" w:hAnsi="Times New Roman" w:cs="Times New Roman"/>
+        <w:t>. This guard ensures that only authenticated users can access dashboard.</w:t>
+      </w:r>
+    </w:p>
+    <w:p>
+      <w:pPr>
+        <w:rPr>
+          <w:rFonts w:ascii="Times New Roman" w:hAnsi="Times New Roman" w:cs="Times New Roman"/>
+        </w:rPr>
+      </w:pPr>
+      <w:r>
+        <w:rPr>
+          <w:rFonts w:ascii="Times New Roman" w:hAnsi="Times New Roman" w:cs="Times New Roman"/>
+          <w:noProof/>
         </w:rPr>
         <w:drawing>
           <wp:inline distT="0" distB="0" distL="0" distR="0" wp14:anchorId="424B329A" wp14:editId="59E1275E">
@@ -3861,6 +3867,7 @@
       <w:r>
         <w:rPr>
           <w:rFonts w:ascii="Times New Roman" w:hAnsi="Times New Roman" w:cs="Times New Roman"/>
+          <w:noProof/>
         </w:rPr>
         <w:drawing>
           <wp:inline distT="0" distB="0" distL="0" distR="0" wp14:anchorId="4C08C01D" wp14:editId="31B16C1F">
@@ -4074,13 +4081,7 @@
           <w:rFonts w:ascii="Times New Roman" w:hAnsi="Times New Roman" w:cs="Times New Roman"/>
         </w:rPr>
         <w:br/>
-        <w:t>Th</w:t>
-      </w:r>
-      <w:r>
-        <w:rPr>
-          <w:rFonts w:ascii="Times New Roman" w:hAnsi="Times New Roman" w:cs="Times New Roman"/>
-        </w:rPr>
-        <w:t xml:space="preserve">is pipe designed to transform tempo </w:t>
+        <w:t xml:space="preserve">This pipe designed to transform tempo </w:t>
       </w:r>
       <w:proofErr w:type="spellStart"/>
       <w:r>
@@ -4106,6 +4107,7 @@
       <w:r>
         <w:rPr>
           <w:rFonts w:ascii="Times New Roman" w:hAnsi="Times New Roman" w:cs="Times New Roman"/>
+          <w:noProof/>
         </w:rPr>
         <w:lastRenderedPageBreak/>
         <w:drawing>
@@ -4170,11 +4172,6 @@
           <w:rFonts w:ascii="Times New Roman" w:hAnsi="Times New Roman" w:cs="Times New Roman"/>
         </w:rPr>
         <w:br/>
-      </w:r>
-      <w:r>
-        <w:rPr>
-          <w:rFonts w:ascii="Times New Roman" w:hAnsi="Times New Roman" w:cs="Times New Roman"/>
-        </w:rPr>
         <w:t xml:space="preserve">This pipe is designed to transform command keys into user-friendly string descriptions. </w:t>
       </w:r>
       <w:r>
@@ -4186,6 +4183,7 @@
       <w:r>
         <w:rPr>
           <w:rFonts w:ascii="Times New Roman" w:hAnsi="Times New Roman" w:cs="Times New Roman"/>
+          <w:noProof/>
         </w:rPr>
         <w:drawing>
           <wp:inline distT="0" distB="0" distL="0" distR="0" wp14:anchorId="0C303B52" wp14:editId="31606A8B">
@@ -8511,6 +8509,18 @@
   </w:num>
   <w:num w:numId="29" w16cid:durableId="694430480">
     <w:abstractNumId w:val="16"/>
+  </w:num>
+  <w:num w:numId="30" w16cid:durableId="1619339439">
+    <w:abstractNumId w:val="0"/>
+    <w:lvlOverride w:ilvl="0"/>
+    <w:lvlOverride w:ilvl="1"/>
+    <w:lvlOverride w:ilvl="2"/>
+    <w:lvlOverride w:ilvl="3"/>
+    <w:lvlOverride w:ilvl="4"/>
+    <w:lvlOverride w:ilvl="5"/>
+    <w:lvlOverride w:ilvl="6"/>
+    <w:lvlOverride w:ilvl="7"/>
+    <w:lvlOverride w:ilvl="8"/>
   </w:num>
 </w:numbering>
 </file>

</xml_diff>